<commit_message>
Add per-algorithm walkthrough videos and fix Q-table cell counts
- Add scripts/render_algorithm_videos.py, which plays each saved model on
  three held-out episodes and shows its decision values live (Q-table
  entries, DQN Q-values, PPO action probabilities and V(s))
- Add the three rendered walkthrough videos
- Declare imageio[ffmpeg] as a dev dependency (render_videos.py already
  needed it)
- Correct the report: 8x8x8x8x10x10 bins is 409,600 cells, or 1,228,800
  table entries across 3 actions

Co-Authored-By: Claude Opus 5.5 <noreply@anthropic.com>
</commit_message>
<xml_diff>
--- a/Acrobot_RL_Detailed_Report.docx
+++ b/Acrobot_RL_Detailed_Report.docx
@@ -6728,7 +6728,7 @@
         <w:t>8 × 8 × 8 × 8 × 10 × 10</w:t>
       </w:r>
       <w:r>
-        <w:t xml:space="preserve"> bins. With 3 actions, the Q-table has </w:t>
+        <w:t xml:space="preserve"> bins: 409,600 cells. With 3 actions per cell, the Q-table holds </w:t>
       </w:r>
       <w:r>
         <w:rPr>
@@ -16876,7 +16876,7 @@
         <w:t>coarsest</w:t>
       </w:r>
       <w:r>
-        <w:t xml:space="preserve"> grid (4⁴ × 6², only 27,648 cells) gave the best final return at 50,000 interactions, while the finest grid (4.3 million cells) gave the worst. With a limited budget, fewer cells means each cell is visited and updated more often. This is the resolution-versus-coverage trade-off </w:t>
+        <w:t xml:space="preserve"> grid (4⁴ × 6², only 9,216 cells) gave the best final return at 50,000 interactions, while the finest grid (1.44 million cells) gave the worst. With a limited budget, fewer cells means each cell is visited and updated more often. This is the resolution-versus-coverage trade-off </w:t>
       </w:r>
       <w:r>
         <w:lastRenderedPageBreak/>
@@ -21572,7 +21572,7 @@
         <w:t>curse of dimensionality</w:t>
       </w:r>
       <w:r>
-        <w:t>: six dimensions with 8–10 bins give over a million cells. Each cell is learned independently, with no generalisation between neighbours, so most of the table is never visited in 100,000 steps. Coarser grids learn faster but cannot represent a precise policy. Q-Learning is nevertheless the simplest method, the cheapest to run, and fully interpretable.</w:t>
+        <w:t>: six dimensions with 8–10 bins give 409,600 cells (1,228,800 table entries). Each cell is learned independently, with no generalisation between neighbours, so most of the table is never visited in 100,000 steps. Coarser grids learn faster but cannot represent a precise policy. Q-Learning is nevertheless the simplest method, the cheapest to run, and fully interpretable.</w:t>
       </w:r>
     </w:p>
     <w:p>
@@ -24260,7 +24260,7 @@
         <w:spacing w:after="120" w:line="276" w:lineRule="auto"/>
       </w:pPr>
       <w:r>
-        <w:t>A table update is a single array write, but each of the ~1.2 million cells is learned separately, so 100,000 interactions are not enough experience.</w:t>
+        <w:t>A table update is a single array write, but each of the 409,600 cells is learned separately, so 100,000 interactions are not enough experience.</w:t>
       </w:r>
     </w:p>
     <w:p>

</xml_diff>